<commit_message>
commit date 21 where braden say we are so good
</commit_message>
<xml_diff>
--- a/bov_template.docx
+++ b/bov_template.docx
@@ -1005,7 +1005,7 @@
                                 <w:bCs/>
                                 <w:color w:val="0070C0"/>
                               </w:rPr>
-                              <w:t>PREPARED FOR:</w:t>
+                              <w:t xml:space="preserve">PREPARED FOR: </w:t>
                             </w:r>
                             <w:r>
                               <w:rPr>
@@ -1046,7 +1046,7 @@
                                 <w:rFonts w:cs="Arial"/>
                                 <w:color w:val="0070C0"/>
                               </w:rPr>
-                              <w:t>{{address}}</w:t>
+                              <w:t>{{prepared_for_address}}</w:t>
                             </w:r>
                           </w:p>
                         </w:txbxContent>
@@ -1081,7 +1081,7 @@
                           <w:bCs/>
                           <w:color w:val="0070C0"/>
                         </w:rPr>
-                        <w:t>PREPARED FOR:</w:t>
+                        <w:t xml:space="preserve">PREPARED FOR: </w:t>
                       </w:r>
                       <w:r>
                         <w:rPr>
@@ -1122,7 +1122,7 @@
                           <w:rFonts w:cs="Arial"/>
                           <w:color w:val="0070C0"/>
                         </w:rPr>
-                        <w:t>{{address}}</w:t>
+                        <w:t>{{prepared_for_address}}</w:t>
                       </w:r>
                     </w:p>
                   </w:txbxContent>
@@ -1191,7 +1191,7 @@
                                 <w:bCs/>
                                 <w:color w:val="0070C0"/>
                               </w:rPr>
-                              <w:t>PREPARED BY:</w:t>
+                              <w:t xml:space="preserve">PREPARED BY: </w:t>
                             </w:r>
                             <w:r>
                               <w:rPr>
@@ -1297,7 +1297,7 @@
                           <w:bCs/>
                           <w:color w:val="0070C0"/>
                         </w:rPr>
-                        <w:t>PREPARED BY:</w:t>
+                        <w:t xml:space="preserve">PREPARED BY: </w:t>
                       </w:r>
                       <w:r>
                         <w:rPr>
@@ -1602,6 +1602,7 @@
           <w:insideV w:val="none" w:sz="0" w:space="0" w:color="auto"/>
         </w:tblBorders>
         <w:tblLook w:val="04A0" w:firstRow="1" w:lastRow="0" w:firstColumn="1" w:lastColumn="0" w:noHBand="0" w:noVBand="1"/>
+        <w:tblInd w:w="360" w:type="dxa"/>
       </w:tblPr>
       <w:tblGrid>
         <w:gridCol w:w="2985"/>
@@ -1615,10 +1616,18 @@
         <w:tc>
           <w:tcPr>
             <w:tcW w:w="2985" w:type="dxa"/>
+            <w:vAlign w:val="center"/>
+            <w:tcMar>
+              <w:top w:w="80" w:type="dxa"/>
+              <w:left w:w="0" w:type="dxa"/>
+              <w:bottom w:w="80" w:type="dxa"/>
+              <w:right w:w="120" w:type="dxa"/>
+            </w:tcMar>
           </w:tcPr>
           <w:p>
             <w:pPr>
               <w:spacing w:after="0" w:line="240" w:lineRule="auto"/>
+              <w:jc w:val="left"/>
               <w:rPr>
                 <w:rFonts w:cs="Arial"/>
                 <w:color w:val="FFFFFF" w:themeColor="background1"/>
@@ -1628,59 +1637,76 @@
             </w:pPr>
             <w:r>
               <w:rPr>
+                <w:color w:val="FFFFFF" w:themeColor="background1"/>
+                <w:sz w:val="22"/>
+                <w:szCs w:val="22"/>
+              </w:rPr>
+              <w:t>Executive Summary</w:t>
+            </w:r>
+          </w:p>
+        </w:tc>
+        <w:tc>
+          <w:tcPr>
+            <w:tcW w:w="6192" w:type="dxa"/>
+            <w:vAlign w:val="center"/>
+            <w:tcMar>
+              <w:top w:w="80" w:type="dxa"/>
+              <w:left w:w="80" w:type="dxa"/>
+              <w:bottom w:w="80" w:type="dxa"/>
+              <w:right w:w="80" w:type="dxa"/>
+            </w:tcMar>
+          </w:tcPr>
+          <w:p>
+            <w:pPr>
+              <w:spacing w:after="0" w:line="240" w:lineRule="auto"/>
+              <w:jc w:val="left"/>
+              <w:rPr>
+                <w:rFonts w:ascii="Poppins" w:hAnsi="Poppins" w:cs="Poppins"/>
+                <w:color w:val="FFFFFF" w:themeColor="background1"/>
+                <w:sz w:val="20"/>
+                <w:szCs w:val="20"/>
+              </w:rPr>
+              <w:pBdr>
+                <w:bottom w:val="single" w:sz="12" w:space="6" w:color="FFFFFF"/>
+              </w:pBdr>
+            </w:pPr>
+            <w:r>
+              <w:rPr>
+                <w:color w:val="FFFFFF" w:themeColor="background1"/>
+                <w:sz w:val="22"/>
+                <w:szCs w:val="22"/>
+              </w:rPr>
+              <w:t xml:space="preserve"> </w:t>
+            </w:r>
+          </w:p>
+        </w:tc>
+        <w:tc>
+          <w:tcPr>
+            <w:tcW w:w="1078" w:type="dxa"/>
+            <w:vAlign w:val="center"/>
+            <w:tcMar>
+              <w:top w:w="80" w:type="dxa"/>
+              <w:left w:w="120" w:type="dxa"/>
+              <w:bottom w:w="80" w:type="dxa"/>
+              <w:right w:w="0" w:type="dxa"/>
+            </w:tcMar>
+          </w:tcPr>
+          <w:p>
+            <w:pPr>
+              <w:spacing w:after="0" w:line="240" w:lineRule="auto"/>
+              <w:jc w:val="right"/>
+              <w:rPr>
                 <w:rFonts w:cs="Arial"/>
                 <w:color w:val="FFFFFF" w:themeColor="background1"/>
                 <w:sz w:val="20"/>
                 <w:szCs w:val="20"/>
               </w:rPr>
-              <w:t>Executive Summary</w:t>
-            </w:r>
-          </w:p>
-        </w:tc>
-        <w:tc>
-          <w:tcPr>
-            <w:tcW w:w="6192" w:type="dxa"/>
-          </w:tcPr>
-          <w:p>
-            <w:pPr>
-              <w:spacing w:after="0" w:line="240" w:lineRule="auto"/>
-              <w:rPr>
-                <w:rFonts w:ascii="Poppins" w:hAnsi="Poppins" w:cs="Poppins"/>
+            </w:pPr>
+            <w:r>
+              <w:rPr>
                 <w:color w:val="FFFFFF" w:themeColor="background1"/>
-                <w:sz w:val="20"/>
-                <w:szCs w:val="20"/>
-              </w:rPr>
-            </w:pPr>
-            <w:r>
-              <w:rPr>
-                <w:color w:val="FFFFFF" w:themeColor="background1"/>
-                <w:sz w:val="20"/>
-                <w:szCs w:val="20"/>
-              </w:rPr>
-              <w:t>______________________________________________________</w:t>
-            </w:r>
-          </w:p>
-        </w:tc>
-        <w:tc>
-          <w:tcPr>
-            <w:tcW w:w="1078" w:type="dxa"/>
-          </w:tcPr>
-          <w:p>
-            <w:pPr>
-              <w:spacing w:after="0" w:line="240" w:lineRule="auto"/>
-              <w:rPr>
-                <w:rFonts w:cs="Arial"/>
-                <w:color w:val="FFFFFF" w:themeColor="background1"/>
-                <w:sz w:val="20"/>
-                <w:szCs w:val="20"/>
-              </w:rPr>
-            </w:pPr>
-            <w:r>
-              <w:rPr>
-                <w:rFonts w:cs="Arial"/>
-                <w:color w:val="FFFFFF" w:themeColor="background1"/>
-                <w:sz w:val="20"/>
-                <w:szCs w:val="20"/>
+                <w:sz w:val="22"/>
+                <w:szCs w:val="22"/>
               </w:rPr>
               <w:t>3</w:t>
             </w:r>
@@ -1694,10 +1720,18 @@
         <w:tc>
           <w:tcPr>
             <w:tcW w:w="2985" w:type="dxa"/>
+            <w:vAlign w:val="center"/>
+            <w:tcMar>
+              <w:top w:w="80" w:type="dxa"/>
+              <w:left w:w="0" w:type="dxa"/>
+              <w:bottom w:w="80" w:type="dxa"/>
+              <w:right w:w="120" w:type="dxa"/>
+            </w:tcMar>
           </w:tcPr>
           <w:p>
             <w:pPr>
               <w:spacing w:after="0" w:line="240" w:lineRule="auto"/>
+              <w:jc w:val="left"/>
               <w:rPr>
                 <w:rFonts w:cs="Arial"/>
                 <w:color w:val="FFFFFF" w:themeColor="background1"/>
@@ -1705,49 +1739,72 @@
             </w:pPr>
             <w:r>
               <w:rPr>
+                <w:color w:val="FFFFFF" w:themeColor="background1"/>
+                <w:sz w:val="22"/>
+                <w:szCs w:val="22"/>
+              </w:rPr>
+              <w:t>Subject Photos</w:t>
+            </w:r>
+          </w:p>
+        </w:tc>
+        <w:tc>
+          <w:tcPr>
+            <w:tcW w:w="6192" w:type="dxa"/>
+            <w:vAlign w:val="center"/>
+            <w:tcMar>
+              <w:top w:w="80" w:type="dxa"/>
+              <w:left w:w="80" w:type="dxa"/>
+              <w:bottom w:w="80" w:type="dxa"/>
+              <w:right w:w="80" w:type="dxa"/>
+            </w:tcMar>
+          </w:tcPr>
+          <w:p>
+            <w:pPr>
+              <w:spacing w:after="0" w:line="240" w:lineRule="auto"/>
+              <w:jc w:val="left"/>
+              <w:rPr>
+                <w:rFonts w:ascii="Poppins" w:hAnsi="Poppins" w:cs="Poppins"/>
+                <w:color w:val="FFFFFF" w:themeColor="background1"/>
+              </w:rPr>
+              <w:pBdr>
+                <w:bottom w:val="single" w:sz="12" w:space="6" w:color="FFFFFF"/>
+              </w:pBdr>
+            </w:pPr>
+            <w:r>
+              <w:rPr>
+                <w:color w:val="FFFFFF" w:themeColor="background1"/>
+                <w:sz w:val="22"/>
+                <w:szCs w:val="22"/>
+              </w:rPr>
+              <w:t xml:space="preserve"> </w:t>
+            </w:r>
+          </w:p>
+        </w:tc>
+        <w:tc>
+          <w:tcPr>
+            <w:tcW w:w="1078" w:type="dxa"/>
+            <w:vAlign w:val="center"/>
+            <w:tcMar>
+              <w:top w:w="80" w:type="dxa"/>
+              <w:left w:w="120" w:type="dxa"/>
+              <w:bottom w:w="80" w:type="dxa"/>
+              <w:right w:w="0" w:type="dxa"/>
+            </w:tcMar>
+          </w:tcPr>
+          <w:p>
+            <w:pPr>
+              <w:spacing w:after="0" w:line="240" w:lineRule="auto"/>
+              <w:jc w:val="right"/>
+              <w:rPr>
                 <w:rFonts w:cs="Arial"/>
                 <w:color w:val="FFFFFF" w:themeColor="background1"/>
               </w:rPr>
-              <w:t>Subject Photos</w:t>
-            </w:r>
-          </w:p>
-        </w:tc>
-        <w:tc>
-          <w:tcPr>
-            <w:tcW w:w="6192" w:type="dxa"/>
-          </w:tcPr>
-          <w:p>
-            <w:pPr>
-              <w:spacing w:after="0" w:line="240" w:lineRule="auto"/>
-              <w:rPr>
-                <w:rFonts w:ascii="Poppins" w:hAnsi="Poppins" w:cs="Poppins"/>
+            </w:pPr>
+            <w:r>
+              <w:rPr>
                 <w:color w:val="FFFFFF" w:themeColor="background1"/>
-              </w:rPr>
-            </w:pPr>
-            <w:r>
-              <w:rPr>
-                <w:color w:val="FFFFFF" w:themeColor="background1"/>
-              </w:rPr>
-              <w:t>______________________________________________________</w:t>
-            </w:r>
-          </w:p>
-        </w:tc>
-        <w:tc>
-          <w:tcPr>
-            <w:tcW w:w="1078" w:type="dxa"/>
-          </w:tcPr>
-          <w:p>
-            <w:pPr>
-              <w:spacing w:after="0" w:line="240" w:lineRule="auto"/>
-              <w:rPr>
-                <w:rFonts w:cs="Arial"/>
-                <w:color w:val="FFFFFF" w:themeColor="background1"/>
-              </w:rPr>
-            </w:pPr>
-            <w:r>
-              <w:rPr>
-                <w:rFonts w:cs="Arial"/>
-                <w:color w:val="FFFFFF" w:themeColor="background1"/>
+                <w:sz w:val="22"/>
+                <w:szCs w:val="22"/>
               </w:rPr>
               <w:t>5</w:t>
             </w:r>
@@ -1761,10 +1818,18 @@
         <w:tc>
           <w:tcPr>
             <w:tcW w:w="2985" w:type="dxa"/>
+            <w:vAlign w:val="center"/>
+            <w:tcMar>
+              <w:top w:w="80" w:type="dxa"/>
+              <w:left w:w="0" w:type="dxa"/>
+              <w:bottom w:w="80" w:type="dxa"/>
+              <w:right w:w="120" w:type="dxa"/>
+            </w:tcMar>
           </w:tcPr>
           <w:p>
             <w:pPr>
               <w:spacing w:after="0" w:line="240" w:lineRule="auto"/>
+              <w:jc w:val="left"/>
               <w:rPr>
                 <w:rFonts w:cs="Arial"/>
                 <w:color w:val="FFFFFF" w:themeColor="background1"/>
@@ -1772,49 +1837,72 @@
             </w:pPr>
             <w:r>
               <w:rPr>
+                <w:color w:val="FFFFFF" w:themeColor="background1"/>
+                <w:sz w:val="22"/>
+                <w:szCs w:val="22"/>
+              </w:rPr>
+              <w:t>Demographics</w:t>
+            </w:r>
+          </w:p>
+        </w:tc>
+        <w:tc>
+          <w:tcPr>
+            <w:tcW w:w="6192" w:type="dxa"/>
+            <w:vAlign w:val="center"/>
+            <w:tcMar>
+              <w:top w:w="80" w:type="dxa"/>
+              <w:left w:w="80" w:type="dxa"/>
+              <w:bottom w:w="80" w:type="dxa"/>
+              <w:right w:w="80" w:type="dxa"/>
+            </w:tcMar>
+          </w:tcPr>
+          <w:p>
+            <w:pPr>
+              <w:spacing w:after="0" w:line="240" w:lineRule="auto"/>
+              <w:jc w:val="left"/>
+              <w:rPr>
+                <w:rFonts w:ascii="Poppins" w:hAnsi="Poppins" w:cs="Poppins"/>
+                <w:color w:val="FFFFFF" w:themeColor="background1"/>
+              </w:rPr>
+              <w:pBdr>
+                <w:bottom w:val="single" w:sz="12" w:space="6" w:color="FFFFFF"/>
+              </w:pBdr>
+            </w:pPr>
+            <w:r>
+              <w:rPr>
+                <w:color w:val="FFFFFF" w:themeColor="background1"/>
+                <w:sz w:val="22"/>
+                <w:szCs w:val="22"/>
+              </w:rPr>
+              <w:t xml:space="preserve"> </w:t>
+            </w:r>
+          </w:p>
+        </w:tc>
+        <w:tc>
+          <w:tcPr>
+            <w:tcW w:w="1078" w:type="dxa"/>
+            <w:vAlign w:val="center"/>
+            <w:tcMar>
+              <w:top w:w="80" w:type="dxa"/>
+              <w:left w:w="120" w:type="dxa"/>
+              <w:bottom w:w="80" w:type="dxa"/>
+              <w:right w:w="0" w:type="dxa"/>
+            </w:tcMar>
+          </w:tcPr>
+          <w:p>
+            <w:pPr>
+              <w:spacing w:after="0" w:line="240" w:lineRule="auto"/>
+              <w:jc w:val="right"/>
+              <w:rPr>
                 <w:rFonts w:cs="Arial"/>
                 <w:color w:val="FFFFFF" w:themeColor="background1"/>
               </w:rPr>
-              <w:t>Demographics</w:t>
-            </w:r>
-          </w:p>
-        </w:tc>
-        <w:tc>
-          <w:tcPr>
-            <w:tcW w:w="6192" w:type="dxa"/>
-          </w:tcPr>
-          <w:p>
-            <w:pPr>
-              <w:spacing w:after="0" w:line="240" w:lineRule="auto"/>
-              <w:rPr>
-                <w:rFonts w:ascii="Poppins" w:hAnsi="Poppins" w:cs="Poppins"/>
+            </w:pPr>
+            <w:r>
+              <w:rPr>
                 <w:color w:val="FFFFFF" w:themeColor="background1"/>
-              </w:rPr>
-            </w:pPr>
-            <w:r>
-              <w:rPr>
-                <w:color w:val="FFFFFF" w:themeColor="background1"/>
-              </w:rPr>
-              <w:t>______________________________________________________</w:t>
-            </w:r>
-          </w:p>
-        </w:tc>
-        <w:tc>
-          <w:tcPr>
-            <w:tcW w:w="1078" w:type="dxa"/>
-          </w:tcPr>
-          <w:p>
-            <w:pPr>
-              <w:spacing w:after="0" w:line="240" w:lineRule="auto"/>
-              <w:rPr>
-                <w:rFonts w:cs="Arial"/>
-                <w:color w:val="FFFFFF" w:themeColor="background1"/>
-              </w:rPr>
-            </w:pPr>
-            <w:r>
-              <w:rPr>
-                <w:rFonts w:cs="Arial"/>
-                <w:color w:val="FFFFFF" w:themeColor="background1"/>
+                <w:sz w:val="22"/>
+                <w:szCs w:val="22"/>
               </w:rPr>
               <w:t>5</w:t>
             </w:r>
@@ -1828,10 +1916,18 @@
         <w:tc>
           <w:tcPr>
             <w:tcW w:w="2985" w:type="dxa"/>
+            <w:vAlign w:val="center"/>
+            <w:tcMar>
+              <w:top w:w="80" w:type="dxa"/>
+              <w:left w:w="0" w:type="dxa"/>
+              <w:bottom w:w="80" w:type="dxa"/>
+              <w:right w:w="120" w:type="dxa"/>
+            </w:tcMar>
           </w:tcPr>
           <w:p>
             <w:pPr>
               <w:spacing w:after="0" w:line="240" w:lineRule="auto"/>
+              <w:jc w:val="left"/>
               <w:rPr>
                 <w:rFonts w:cs="Arial"/>
                 <w:color w:val="FFFFFF" w:themeColor="background1"/>
@@ -1839,49 +1935,72 @@
             </w:pPr>
             <w:r>
               <w:rPr>
+                <w:color w:val="FFFFFF" w:themeColor="background1"/>
+                <w:sz w:val="22"/>
+                <w:szCs w:val="22"/>
+              </w:rPr>
+              <w:t>Comparables</w:t>
+            </w:r>
+          </w:p>
+        </w:tc>
+        <w:tc>
+          <w:tcPr>
+            <w:tcW w:w="6192" w:type="dxa"/>
+            <w:vAlign w:val="center"/>
+            <w:tcMar>
+              <w:top w:w="80" w:type="dxa"/>
+              <w:left w:w="80" w:type="dxa"/>
+              <w:bottom w:w="80" w:type="dxa"/>
+              <w:right w:w="80" w:type="dxa"/>
+            </w:tcMar>
+          </w:tcPr>
+          <w:p>
+            <w:pPr>
+              <w:spacing w:after="0" w:line="240" w:lineRule="auto"/>
+              <w:jc w:val="left"/>
+              <w:rPr>
+                <w:rFonts w:ascii="Poppins" w:hAnsi="Poppins" w:cs="Poppins"/>
+                <w:color w:val="FFFFFF" w:themeColor="background1"/>
+              </w:rPr>
+              <w:pBdr>
+                <w:bottom w:val="single" w:sz="12" w:space="6" w:color="FFFFFF"/>
+              </w:pBdr>
+            </w:pPr>
+            <w:r>
+              <w:rPr>
+                <w:color w:val="FFFFFF" w:themeColor="background1"/>
+                <w:sz w:val="22"/>
+                <w:szCs w:val="22"/>
+              </w:rPr>
+              <w:t xml:space="preserve"> </w:t>
+            </w:r>
+          </w:p>
+        </w:tc>
+        <w:tc>
+          <w:tcPr>
+            <w:tcW w:w="1078" w:type="dxa"/>
+            <w:vAlign w:val="center"/>
+            <w:tcMar>
+              <w:top w:w="80" w:type="dxa"/>
+              <w:left w:w="120" w:type="dxa"/>
+              <w:bottom w:w="80" w:type="dxa"/>
+              <w:right w:w="0" w:type="dxa"/>
+            </w:tcMar>
+          </w:tcPr>
+          <w:p>
+            <w:pPr>
+              <w:spacing w:after="0" w:line="240" w:lineRule="auto"/>
+              <w:jc w:val="right"/>
+              <w:rPr>
                 <w:rFonts w:cs="Arial"/>
                 <w:color w:val="FFFFFF" w:themeColor="background1"/>
               </w:rPr>
-              <w:t>Comparables</w:t>
-            </w:r>
-          </w:p>
-        </w:tc>
-        <w:tc>
-          <w:tcPr>
-            <w:tcW w:w="6192" w:type="dxa"/>
-          </w:tcPr>
-          <w:p>
-            <w:pPr>
-              <w:spacing w:after="0" w:line="240" w:lineRule="auto"/>
-              <w:rPr>
-                <w:rFonts w:ascii="Poppins" w:hAnsi="Poppins" w:cs="Poppins"/>
+            </w:pPr>
+            <w:r>
+              <w:rPr>
                 <w:color w:val="FFFFFF" w:themeColor="background1"/>
-              </w:rPr>
-            </w:pPr>
-            <w:r>
-              <w:rPr>
-                <w:color w:val="FFFFFF" w:themeColor="background1"/>
-              </w:rPr>
-              <w:t>______________________________________________________</w:t>
-            </w:r>
-          </w:p>
-        </w:tc>
-        <w:tc>
-          <w:tcPr>
-            <w:tcW w:w="1078" w:type="dxa"/>
-          </w:tcPr>
-          <w:p>
-            <w:pPr>
-              <w:spacing w:after="0" w:line="240" w:lineRule="auto"/>
-              <w:rPr>
-                <w:rFonts w:cs="Arial"/>
-                <w:color w:val="FFFFFF" w:themeColor="background1"/>
-              </w:rPr>
-            </w:pPr>
-            <w:r>
-              <w:rPr>
-                <w:rFonts w:cs="Arial"/>
-                <w:color w:val="FFFFFF" w:themeColor="background1"/>
+                <w:sz w:val="22"/>
+                <w:szCs w:val="22"/>
               </w:rPr>
               <w:t>14</w:t>
             </w:r>
@@ -1895,10 +2014,18 @@
         <w:tc>
           <w:tcPr>
             <w:tcW w:w="2985" w:type="dxa"/>
+            <w:vAlign w:val="center"/>
+            <w:tcMar>
+              <w:top w:w="80" w:type="dxa"/>
+              <w:left w:w="0" w:type="dxa"/>
+              <w:bottom w:w="80" w:type="dxa"/>
+              <w:right w:w="120" w:type="dxa"/>
+            </w:tcMar>
           </w:tcPr>
           <w:p>
             <w:pPr>
               <w:spacing w:after="0" w:line="240" w:lineRule="auto"/>
+              <w:jc w:val="left"/>
               <w:rPr>
                 <w:rFonts w:cs="Arial"/>
                 <w:color w:val="FFFFFF" w:themeColor="background1"/>
@@ -1906,49 +2033,72 @@
             </w:pPr>
             <w:r>
               <w:rPr>
+                <w:color w:val="FFFFFF" w:themeColor="background1"/>
+                <w:sz w:val="22"/>
+                <w:szCs w:val="22"/>
+              </w:rPr>
+              <w:t>Certification</w:t>
+            </w:r>
+          </w:p>
+        </w:tc>
+        <w:tc>
+          <w:tcPr>
+            <w:tcW w:w="6192" w:type="dxa"/>
+            <w:vAlign w:val="center"/>
+            <w:tcMar>
+              <w:top w:w="80" w:type="dxa"/>
+              <w:left w:w="80" w:type="dxa"/>
+              <w:bottom w:w="80" w:type="dxa"/>
+              <w:right w:w="80" w:type="dxa"/>
+            </w:tcMar>
+          </w:tcPr>
+          <w:p>
+            <w:pPr>
+              <w:spacing w:after="0" w:line="240" w:lineRule="auto"/>
+              <w:jc w:val="left"/>
+              <w:rPr>
+                <w:rFonts w:ascii="Poppins" w:hAnsi="Poppins" w:cs="Poppins"/>
+                <w:color w:val="FFFFFF" w:themeColor="background1"/>
+              </w:rPr>
+              <w:pBdr>
+                <w:bottom w:val="single" w:sz="12" w:space="6" w:color="FFFFFF"/>
+              </w:pBdr>
+            </w:pPr>
+            <w:r>
+              <w:rPr>
+                <w:color w:val="FFFFFF" w:themeColor="background1"/>
+                <w:sz w:val="22"/>
+                <w:szCs w:val="22"/>
+              </w:rPr>
+              <w:t xml:space="preserve"> </w:t>
+            </w:r>
+          </w:p>
+        </w:tc>
+        <w:tc>
+          <w:tcPr>
+            <w:tcW w:w="1078" w:type="dxa"/>
+            <w:vAlign w:val="center"/>
+            <w:tcMar>
+              <w:top w:w="80" w:type="dxa"/>
+              <w:left w:w="120" w:type="dxa"/>
+              <w:bottom w:w="80" w:type="dxa"/>
+              <w:right w:w="0" w:type="dxa"/>
+            </w:tcMar>
+          </w:tcPr>
+          <w:p>
+            <w:pPr>
+              <w:spacing w:after="0" w:line="240" w:lineRule="auto"/>
+              <w:jc w:val="right"/>
+              <w:rPr>
                 <w:rFonts w:cs="Arial"/>
                 <w:color w:val="FFFFFF" w:themeColor="background1"/>
               </w:rPr>
-              <w:t>Certification</w:t>
-            </w:r>
-          </w:p>
-        </w:tc>
-        <w:tc>
-          <w:tcPr>
-            <w:tcW w:w="6192" w:type="dxa"/>
-          </w:tcPr>
-          <w:p>
-            <w:pPr>
-              <w:spacing w:after="0" w:line="240" w:lineRule="auto"/>
-              <w:rPr>
-                <w:rFonts w:ascii="Poppins" w:hAnsi="Poppins" w:cs="Poppins"/>
+            </w:pPr>
+            <w:r>
+              <w:rPr>
                 <w:color w:val="FFFFFF" w:themeColor="background1"/>
-              </w:rPr>
-            </w:pPr>
-            <w:r>
-              <w:rPr>
-                <w:color w:val="FFFFFF" w:themeColor="background1"/>
-              </w:rPr>
-              <w:t>______________________________________________________</w:t>
-            </w:r>
-          </w:p>
-        </w:tc>
-        <w:tc>
-          <w:tcPr>
-            <w:tcW w:w="1078" w:type="dxa"/>
-          </w:tcPr>
-          <w:p>
-            <w:pPr>
-              <w:spacing w:after="0" w:line="240" w:lineRule="auto"/>
-              <w:rPr>
-                <w:rFonts w:cs="Arial"/>
-                <w:color w:val="FFFFFF" w:themeColor="background1"/>
-              </w:rPr>
-            </w:pPr>
-            <w:r>
-              <w:rPr>
-                <w:rFonts w:cs="Arial"/>
-                <w:color w:val="FFFFFF" w:themeColor="background1"/>
+                <w:sz w:val="22"/>
+                <w:szCs w:val="22"/>
               </w:rPr>
               <w:t>21</w:t>
             </w:r>
@@ -2172,7 +2322,7 @@
                                 <w:sz w:val="36"/>
                                 <w:szCs w:val="36"/>
                               </w:rPr>
-                              <w:t>Date: May 09, 2026</w:t>
+                              <w:t>Date: {{Date}}</w:t>
                             </w:r>
                           </w:p>
                           <w:p>
@@ -2224,7 +2374,7 @@
                           <w:sz w:val="36"/>
                           <w:szCs w:val="36"/>
                         </w:rPr>
-                        <w:t>Date: May 09, 2026</w:t>
+                        <w:t>Date: {{Date}}</w:t>
                       </w:r>
                     </w:p>
                     <w:p>
@@ -4705,7 +4855,7 @@
                                 <w:sz w:val="36"/>
                                 <w:szCs w:val="36"/>
                               </w:rPr>
-                              <w:t>Date: May 09, 2026</w:t>
+                              <w:t>Date: {{Date}}</w:t>
                             </w:r>
                           </w:p>
                           <w:p>
@@ -4757,7 +4907,7 @@
                           <w:sz w:val="36"/>
                           <w:szCs w:val="36"/>
                         </w:rPr>
-                        <w:t>Date: May 09, 2026</w:t>
+                        <w:t>Date: {{Date}}</w:t>
                       </w:r>
                     </w:p>
                     <w:p>
@@ -5428,21 +5578,24 @@
         <w:spacing w:line="276" w:lineRule="auto"/>
         <w:rPr>
           <w:rFonts w:asciiTheme="minorHAnsi" w:hAnsiTheme="minorHAnsi" w:cs="Arial"/>
+          <w:sz w:val="24"/>
+          <w:szCs w:val="24"/>
         </w:rPr>
       </w:pPr>
       <w:r>
         <w:rPr>
           <w:rFonts w:asciiTheme="minorHAnsi" w:hAnsiTheme="minorHAnsi" w:cs="Arial"/>
-        </w:rPr>
-        <w:t xml:space="preserve">Source: </w:t>
+          <w:sz w:val="24"/>
+          <w:szCs w:val="24"/>
+        </w:rPr>
+        <w:t>Source: Esri GeoEnrichment</w:t>
       </w:r>
       <w:r>
         <w:rPr>
           <w:rFonts w:asciiTheme="minorHAnsi" w:hAnsiTheme="minorHAnsi" w:cs="Arial"/>
-          <w:sz w:val="18"/>
-          <w:szCs w:val="18"/>
-        </w:rPr>
-        <w:t>US Census</w:t>
+          <w:sz w:val="24"/>
+          <w:szCs w:val="24"/>
+        </w:rPr>
       </w:r>
     </w:p>
     <w:tbl>
@@ -5820,21 +5973,24 @@
         <w:spacing w:line="276" w:lineRule="auto"/>
         <w:rPr>
           <w:rFonts w:asciiTheme="minorHAnsi" w:hAnsiTheme="minorHAnsi" w:cs="Arial"/>
+          <w:sz w:val="24"/>
+          <w:szCs w:val="24"/>
         </w:rPr>
       </w:pPr>
       <w:r>
         <w:rPr>
           <w:rFonts w:asciiTheme="minorHAnsi" w:hAnsiTheme="minorHAnsi" w:cs="Arial"/>
-        </w:rPr>
-        <w:t xml:space="preserve">Source: </w:t>
+          <w:sz w:val="24"/>
+          <w:szCs w:val="24"/>
+        </w:rPr>
+        <w:t>Source: Esri GeoEnrichment</w:t>
       </w:r>
       <w:r>
         <w:rPr>
           <w:rFonts w:asciiTheme="minorHAnsi" w:hAnsiTheme="minorHAnsi" w:cs="Arial"/>
-          <w:sz w:val="18"/>
-          <w:szCs w:val="18"/>
-        </w:rPr>
-        <w:t>US Census</w:t>
+          <w:sz w:val="24"/>
+          <w:szCs w:val="24"/>
+        </w:rPr>
       </w:r>
     </w:p>
     <w:p>
@@ -6361,21 +6517,24 @@
         <w:spacing w:line="276" w:lineRule="auto"/>
         <w:rPr>
           <w:rFonts w:asciiTheme="minorHAnsi" w:hAnsiTheme="minorHAnsi" w:cs="Arial"/>
+          <w:sz w:val="24"/>
+          <w:szCs w:val="24"/>
         </w:rPr>
       </w:pPr>
       <w:r>
         <w:rPr>
           <w:rFonts w:asciiTheme="minorHAnsi" w:hAnsiTheme="minorHAnsi" w:cs="Arial"/>
-        </w:rPr>
-        <w:t xml:space="preserve">Source: </w:t>
+          <w:sz w:val="24"/>
+          <w:szCs w:val="24"/>
+        </w:rPr>
+        <w:t>Source: Esri GeoEnrichment</w:t>
       </w:r>
       <w:r>
         <w:rPr>
           <w:rFonts w:asciiTheme="minorHAnsi" w:hAnsiTheme="minorHAnsi" w:cs="Arial"/>
-          <w:sz w:val="18"/>
-          <w:szCs w:val="18"/>
-        </w:rPr>
-        <w:t>US Census</w:t>
+          <w:sz w:val="24"/>
+          <w:szCs w:val="24"/>
+        </w:rPr>
       </w:r>
     </w:p>
     <w:tbl>
@@ -6853,21 +7012,24 @@
         <w:spacing w:line="276" w:lineRule="auto"/>
         <w:rPr>
           <w:rFonts w:asciiTheme="minorHAnsi" w:hAnsiTheme="minorHAnsi" w:cs="Arial"/>
+          <w:sz w:val="24"/>
+          <w:szCs w:val="24"/>
         </w:rPr>
       </w:pPr>
       <w:r>
         <w:rPr>
           <w:rFonts w:asciiTheme="minorHAnsi" w:hAnsiTheme="minorHAnsi" w:cs="Arial"/>
-        </w:rPr>
-        <w:t xml:space="preserve">Source: </w:t>
+          <w:sz w:val="24"/>
+          <w:szCs w:val="24"/>
+        </w:rPr>
+        <w:t>Source: Esri GeoEnrichment</w:t>
       </w:r>
       <w:r>
         <w:rPr>
           <w:rFonts w:asciiTheme="minorHAnsi" w:hAnsiTheme="minorHAnsi" w:cs="Arial"/>
-          <w:sz w:val="18"/>
-          <w:szCs w:val="18"/>
-        </w:rPr>
-        <w:t>US Census</w:t>
+          <w:sz w:val="24"/>
+          <w:szCs w:val="24"/>
+        </w:rPr>
       </w:r>
     </w:p>
     <w:p>
@@ -7263,21 +7425,24 @@
         <w:spacing w:line="276" w:lineRule="auto"/>
         <w:rPr>
           <w:rFonts w:asciiTheme="minorHAnsi" w:hAnsiTheme="minorHAnsi" w:cs="Arial"/>
+          <w:sz w:val="24"/>
+          <w:szCs w:val="24"/>
         </w:rPr>
       </w:pPr>
       <w:r>
         <w:rPr>
           <w:rFonts w:asciiTheme="minorHAnsi" w:hAnsiTheme="minorHAnsi" w:cs="Arial"/>
-        </w:rPr>
-        <w:t xml:space="preserve">Source: </w:t>
+          <w:sz w:val="24"/>
+          <w:szCs w:val="24"/>
+        </w:rPr>
+        <w:t>Source: Esri GeoEnrichment</w:t>
       </w:r>
       <w:r>
         <w:rPr>
           <w:rFonts w:asciiTheme="minorHAnsi" w:hAnsiTheme="minorHAnsi" w:cs="Arial"/>
-          <w:sz w:val="18"/>
-          <w:szCs w:val="18"/>
-        </w:rPr>
-        <w:t>US Census</w:t>
+          <w:sz w:val="24"/>
+          <w:szCs w:val="24"/>
+        </w:rPr>
       </w:r>
     </w:p>
     <w:p>
@@ -7292,7 +7457,6 @@
         <w:rPr>
           <w:rFonts w:asciiTheme="minorHAnsi" w:hAnsiTheme="minorHAnsi" w:cs="Arial"/>
         </w:rPr>
-        <w:t>{{economic_factors}}</w:t>
       </w:r>
       <w:r>
         <w:rPr>
@@ -8001,7 +8165,7 @@
                 <w:sz w:val="16"/>
                 <w:szCs w:val="16"/>
               </w:rPr>
-              <w:t>11,800</w:t>
+              <w:t>{{r1_pop_2010}}</w:t>
             </w:r>
           </w:p>
         </w:tc>
@@ -8028,7 +8192,7 @@
                 <w:sz w:val="16"/>
                 <w:szCs w:val="16"/>
               </w:rPr>
-              <w:t>78,293</w:t>
+              <w:t>{{r3_pop_2010}}</w:t>
             </w:r>
           </w:p>
         </w:tc>
@@ -8055,7 +8219,7 @@
                 <w:sz w:val="16"/>
                 <w:szCs w:val="16"/>
               </w:rPr>
-              <w:t>179,087</w:t>
+              <w:t>{{r5_pop_2010}}</w:t>
             </w:r>
           </w:p>
         </w:tc>
@@ -8265,7 +8429,7 @@
                 <w:sz w:val="16"/>
                 <w:szCs w:val="16"/>
               </w:rPr>
-              <w:t>13,538</w:t>
+              <w:t>{{r1_pop_2020}}</w:t>
             </w:r>
           </w:p>
         </w:tc>
@@ -8292,7 +8456,7 @@
                 <w:sz w:val="16"/>
                 <w:szCs w:val="16"/>
               </w:rPr>
-              <w:t>92,721</w:t>
+              <w:t>{{r3_pop_2020}}</w:t>
             </w:r>
           </w:p>
         </w:tc>
@@ -8319,7 +8483,7 @@
                 <w:sz w:val="16"/>
                 <w:szCs w:val="16"/>
               </w:rPr>
-              <w:t>210,359</w:t>
+              <w:t>{{r5_pop_2020}}</w:t>
             </w:r>
           </w:p>
         </w:tc>
@@ -8408,7 +8572,7 @@
                 <w:sz w:val="16"/>
                 <w:szCs w:val="16"/>
               </w:rPr>
-              <w:t>$188,789</w:t>
+              <w:t>{{r1_avg_hh_income_2029}}</w:t>
             </w:r>
           </w:p>
         </w:tc>
@@ -8435,7 +8599,7 @@
                 <w:sz w:val="16"/>
                 <w:szCs w:val="16"/>
               </w:rPr>
-              <w:t>$141,015</w:t>
+              <w:t>{{r3_avg_hh_income_2029}}</w:t>
             </w:r>
           </w:p>
         </w:tc>
@@ -8462,7 +8626,7 @@
                 <w:sz w:val="16"/>
                 <w:szCs w:val="16"/>
               </w:rPr>
-              <w:t>$143,364</w:t>
+              <w:t>{{r5_avg_hh_income_2029}}</w:t>
             </w:r>
           </w:p>
         </w:tc>
@@ -8669,7 +8833,7 @@
                 <w:sz w:val="16"/>
                 <w:szCs w:val="16"/>
               </w:rPr>
-              <w:t>-1.0%</w:t>
+              <w:t>{{r1_avg_inc_chg}}</w:t>
             </w:r>
           </w:p>
         </w:tc>
@@ -8696,7 +8860,7 @@
                 <w:sz w:val="16"/>
                 <w:szCs w:val="16"/>
               </w:rPr>
-              <w:t>0.6%</w:t>
+              <w:t>{{r3_avg_inc_chg}}</w:t>
             </w:r>
           </w:p>
         </w:tc>
@@ -8723,7 +8887,7 @@
                 <w:sz w:val="16"/>
                 <w:szCs w:val="16"/>
               </w:rPr>
-              <w:t>2.0%</w:t>
+              <w:t>{{r5_avg_inc_chg}}</w:t>
             </w:r>
           </w:p>
         </w:tc>
@@ -9033,7 +9197,7 @@
                 <w:sz w:val="16"/>
                 <w:szCs w:val="16"/>
               </w:rPr>
-              <w:t>14.7%</w:t>
+              <w:t>{{r1_pop_chg_2010_2020}}</w:t>
             </w:r>
           </w:p>
         </w:tc>
@@ -9060,7 +9224,7 @@
                 <w:sz w:val="16"/>
                 <w:szCs w:val="16"/>
               </w:rPr>
-              <w:t>18.4%</w:t>
+              <w:t>{{r3_pop_chg_2010_2020}}</w:t>
             </w:r>
           </w:p>
         </w:tc>
@@ -9087,7 +9251,7 @@
                 <w:sz w:val="16"/>
                 <w:szCs w:val="16"/>
               </w:rPr>
-              <w:t>17.5%</w:t>
+              <w:t>{{r5_pop_chg_2010_2020}}</w:t>
             </w:r>
           </w:p>
         </w:tc>
@@ -9297,7 +9461,7 @@
                 <w:sz w:val="16"/>
                 <w:szCs w:val="16"/>
               </w:rPr>
-              <w:t>-2.2%</w:t>
+              <w:t>{{r1_pop_chg_2020_2024}}</w:t>
             </w:r>
           </w:p>
         </w:tc>
@@ -9324,7 +9488,7 @@
                 <w:sz w:val="16"/>
                 <w:szCs w:val="16"/>
               </w:rPr>
-              <w:t>2.6%</w:t>
+              <w:t>{{r3_pop_chg_2020_2024}}</w:t>
             </w:r>
           </w:p>
         </w:tc>
@@ -9351,7 +9515,7 @@
                 <w:sz w:val="16"/>
                 <w:szCs w:val="16"/>
               </w:rPr>
-              <w:t>3.9%</w:t>
+              <w:t>{{r5_pop_chg_2020_2024}}</w:t>
             </w:r>
           </w:p>
         </w:tc>
@@ -9440,7 +9604,7 @@
                 <w:sz w:val="16"/>
                 <w:szCs w:val="16"/>
               </w:rPr>
-              <w:t>$154,196</w:t>
+              <w:t>{{r1_median_hh_income_2029}}</w:t>
             </w:r>
           </w:p>
         </w:tc>
@@ -9467,7 +9631,7 @@
                 <w:sz w:val="16"/>
                 <w:szCs w:val="16"/>
               </w:rPr>
-              <w:t>$99,846</w:t>
+              <w:t>{{r3_median_hh_income_2029}}</w:t>
             </w:r>
           </w:p>
         </w:tc>
@@ -9494,7 +9658,7 @@
                 <w:sz w:val="16"/>
                 <w:szCs w:val="16"/>
               </w:rPr>
-              <w:t>$105,504</w:t>
+              <w:t>{{r5_median_hh_income_2029}}</w:t>
             </w:r>
           </w:p>
         </w:tc>
@@ -9558,7 +9722,7 @@
                 <w:sz w:val="16"/>
                 <w:szCs w:val="16"/>
               </w:rPr>
-              <w:t>-1.1%</w:t>
+              <w:t>{{r1_pop_chg_2024_2029}}</w:t>
             </w:r>
           </w:p>
         </w:tc>
@@ -9585,7 +9749,7 @@
                 <w:sz w:val="16"/>
                 <w:szCs w:val="16"/>
               </w:rPr>
-              <w:t>0.6%</w:t>
+              <w:t>{{r3_pop_chg_2024_2029}}</w:t>
             </w:r>
           </w:p>
         </w:tc>
@@ -9612,7 +9776,7 @@
                 <w:sz w:val="16"/>
                 <w:szCs w:val="16"/>
               </w:rPr>
-              <w:t>1.9%</w:t>
+              <w:t>{{r5_pop_chg_2024_2029}}</w:t>
             </w:r>
           </w:p>
         </w:tc>
@@ -9701,7 +9865,7 @@
                 <w:sz w:val="16"/>
                 <w:szCs w:val="16"/>
               </w:rPr>
-              <w:t>-1.0%</w:t>
+              <w:t>{{r1_med_inc_chg}}</w:t>
             </w:r>
           </w:p>
         </w:tc>
@@ -9728,7 +9892,7 @@
                 <w:sz w:val="16"/>
                 <w:szCs w:val="16"/>
               </w:rPr>
-              <w:t>0.6%</w:t>
+              <w:t>{{r3_med_inc_chg}}</w:t>
             </w:r>
           </w:p>
         </w:tc>
@@ -9755,7 +9919,7 @@
                 <w:sz w:val="16"/>
                 <w:szCs w:val="16"/>
               </w:rPr>
-              <w:t>2.0%</w:t>
+              <w:t>{{r5_med_inc_chg}}</w:t>
             </w:r>
           </w:p>
         </w:tc>
@@ -10048,7 +10212,7 @@
                 <w:sz w:val="16"/>
                 <w:szCs w:val="16"/>
               </w:rPr>
-              <w:t>4,286</w:t>
+              <w:t>{{r1_hh_2010}}</w:t>
             </w:r>
           </w:p>
         </w:tc>
@@ -10075,7 +10239,7 @@
                 <w:sz w:val="16"/>
                 <w:szCs w:val="16"/>
               </w:rPr>
-              <w:t>31,505</w:t>
+              <w:t>{{r3_hh_2010}}</w:t>
             </w:r>
           </w:p>
         </w:tc>
@@ -10102,7 +10266,7 @@
                 <w:sz w:val="16"/>
                 <w:szCs w:val="16"/>
               </w:rPr>
-              <w:t>69,307</w:t>
+              <w:t>{{r5_hh_2010}}</w:t>
             </w:r>
           </w:p>
         </w:tc>
@@ -10309,7 +10473,7 @@
                 <w:sz w:val="16"/>
                 <w:szCs w:val="16"/>
               </w:rPr>
-              <w:t>928,341</w:t>
+              <w:t>{{r1_hh_2020}}</w:t>
             </w:r>
           </w:p>
         </w:tc>
@@ -10336,7 +10500,7 @@
                 <w:sz w:val="16"/>
                 <w:szCs w:val="16"/>
               </w:rPr>
-              <w:t>928,341</w:t>
+              <w:t>{{r3_hh_2020}}</w:t>
             </w:r>
           </w:p>
         </w:tc>
@@ -10363,7 +10527,7 @@
                 <w:sz w:val="16"/>
                 <w:szCs w:val="16"/>
               </w:rPr>
-              <w:t>928,341</w:t>
+              <w:t>{{r5_hh_2020}}</w:t>
             </w:r>
           </w:p>
         </w:tc>
@@ -10452,7 +10616,7 @@
                 <w:sz w:val="16"/>
                 <w:szCs w:val="16"/>
               </w:rPr>
-              <w:t>$68,739</w:t>
+              <w:t>{{r1_per_capita_income_2029}}</w:t>
             </w:r>
           </w:p>
         </w:tc>
@@ -10479,7 +10643,7 @@
                 <w:sz w:val="16"/>
                 <w:szCs w:val="16"/>
               </w:rPr>
-              <w:t>$58,698</w:t>
+              <w:t>{{r3_per_capita_income_2029}}</w:t>
             </w:r>
           </w:p>
         </w:tc>
@@ -10506,7 +10670,7 @@
                 <w:sz w:val="16"/>
                 <w:szCs w:val="16"/>
               </w:rPr>
-              <w:t>$56,825</w:t>
+              <w:t>{{r5_per_capita_income_2029}}</w:t>
             </w:r>
           </w:p>
         </w:tc>
@@ -10713,7 +10877,7 @@
                 <w:sz w:val="16"/>
                 <w:szCs w:val="16"/>
               </w:rPr>
-              <w:t>-1.0%</w:t>
+              <w:t>{{r1_pci_chg}}</w:t>
             </w:r>
           </w:p>
         </w:tc>
@@ -10740,7 +10904,7 @@
                 <w:sz w:val="16"/>
                 <w:szCs w:val="16"/>
               </w:rPr>
-              <w:t>0.6%</w:t>
+              <w:t>{{r3_pci_chg}}</w:t>
             </w:r>
           </w:p>
         </w:tc>
@@ -10767,7 +10931,7 @@
                 <w:sz w:val="16"/>
                 <w:szCs w:val="16"/>
               </w:rPr>
-              <w:t>2.0%</w:t>
+              <w:t>{{r5_pci_chg}}</w:t>
             </w:r>
           </w:p>
         </w:tc>
@@ -11077,7 +11241,7 @@
                 <w:sz w:val="16"/>
                 <w:szCs w:val="16"/>
               </w:rPr>
-              <w:t>1.1%</w:t>
+              <w:t>{{r1_hh_chg_2010_2020}}</w:t>
             </w:r>
           </w:p>
         </w:tc>
@@ -11104,7 +11268,7 @@
                 <w:sz w:val="16"/>
                 <w:szCs w:val="16"/>
               </w:rPr>
-              <w:t>1.1%</w:t>
+              <w:t>{{r3_hh_chg_2010_2020}}</w:t>
             </w:r>
           </w:p>
         </w:tc>
@@ -11131,7 +11295,7 @@
                 <w:sz w:val="16"/>
                 <w:szCs w:val="16"/>
               </w:rPr>
-              <w:t>1.1%</w:t>
+              <w:t>{{r5_hh_chg_2010_2020}}</w:t>
             </w:r>
           </w:p>
         </w:tc>
@@ -11220,7 +11384,7 @@
                 <w:sz w:val="16"/>
                 <w:szCs w:val="16"/>
               </w:rPr>
-              <w:t>78,406</w:t>
+              <w:t>{{r1_inc_lt_15k}}</w:t>
             </w:r>
           </w:p>
         </w:tc>
@@ -11247,7 +11411,7 @@
                 <w:sz w:val="16"/>
                 <w:szCs w:val="16"/>
               </w:rPr>
-              <w:t>78,406</w:t>
+              <w:t>{{r3_inc_lt_15k}}</w:t>
             </w:r>
           </w:p>
         </w:tc>
@@ -11274,7 +11438,7 @@
                 <w:sz w:val="16"/>
                 <w:szCs w:val="16"/>
               </w:rPr>
-              <w:t>78,406</w:t>
+              <w:t>{{r5_inc_lt_15k}}</w:t>
             </w:r>
           </w:p>
         </w:tc>
@@ -11338,7 +11502,7 @@
                 <w:sz w:val="16"/>
                 <w:szCs w:val="16"/>
               </w:rPr>
-              <w:t>1.1%</w:t>
+              <w:t>{{r1_hh_chg_2020_2024}}</w:t>
             </w:r>
           </w:p>
         </w:tc>
@@ -11365,7 +11529,7 @@
                 <w:sz w:val="16"/>
                 <w:szCs w:val="16"/>
               </w:rPr>
-              <w:t>1.1%</w:t>
+              <w:t>{{r3_hh_chg_2020_2024}}</w:t>
             </w:r>
           </w:p>
         </w:tc>
@@ -11392,7 +11556,7 @@
                 <w:sz w:val="16"/>
                 <w:szCs w:val="16"/>
               </w:rPr>
-              <w:t>1.1%</w:t>
+              <w:t>{{r5_hh_chg_2020_2024}}</w:t>
             </w:r>
           </w:p>
         </w:tc>
@@ -11481,7 +11645,7 @@
                 <w:sz w:val="16"/>
                 <w:szCs w:val="16"/>
               </w:rPr>
-              <w:t>58,193</w:t>
+              <w:t>{{r1_inc_15_25}}</w:t>
             </w:r>
           </w:p>
         </w:tc>
@@ -11508,7 +11672,7 @@
                 <w:sz w:val="16"/>
                 <w:szCs w:val="16"/>
               </w:rPr>
-              <w:t>58,193</w:t>
+              <w:t>{{r3_inc_15_25}}</w:t>
             </w:r>
           </w:p>
         </w:tc>
@@ -11535,7 +11699,7 @@
                 <w:sz w:val="16"/>
                 <w:szCs w:val="16"/>
               </w:rPr>
-              <w:t>58,193</w:t>
+              <w:t>{{r5_inc_15_25}}</w:t>
             </w:r>
           </w:p>
         </w:tc>
@@ -11599,7 +11763,7 @@
                 <w:sz w:val="16"/>
                 <w:szCs w:val="16"/>
               </w:rPr>
-              <w:t>3.0%</w:t>
+              <w:t>{{r1_hh_chg_2024_2029}}</w:t>
             </w:r>
           </w:p>
         </w:tc>
@@ -11626,7 +11790,7 @@
                 <w:sz w:val="16"/>
                 <w:szCs w:val="16"/>
               </w:rPr>
-              <w:t>8.5%</w:t>
+              <w:t>{{r3_hh_chg_2024_2029}}</w:t>
             </w:r>
           </w:p>
         </w:tc>
@@ -11653,7 +11817,7 @@
                 <w:sz w:val="16"/>
                 <w:szCs w:val="16"/>
               </w:rPr>
-              <w:t>8.2%</w:t>
+              <w:t>{{r5_hh_chg_2024_2029}}</w:t>
             </w:r>
           </w:p>
         </w:tc>
@@ -11742,7 +11906,7 @@
                 <w:sz w:val="16"/>
                 <w:szCs w:val="16"/>
               </w:rPr>
-              <w:t>65,443</w:t>
+              <w:t>{{r1_inc_25_35}}</w:t>
             </w:r>
           </w:p>
         </w:tc>
@@ -11769,7 +11933,7 @@
                 <w:sz w:val="16"/>
                 <w:szCs w:val="16"/>
               </w:rPr>
-              <w:t>65,443</w:t>
+              <w:t>{{r3_inc_25_35}}</w:t>
             </w:r>
           </w:p>
         </w:tc>
@@ -11796,7 +11960,7 @@
                 <w:sz w:val="16"/>
                 <w:szCs w:val="16"/>
               </w:rPr>
-              <w:t>65,443</w:t>
+              <w:t>{{r5_inc_25_35}}</w:t>
             </w:r>
           </w:p>
         </w:tc>
@@ -11989,7 +12153,7 @@
                 <w:sz w:val="16"/>
                 <w:szCs w:val="16"/>
               </w:rPr>
-              <w:t>113,751</w:t>
+              <w:t>{{r1_inc_35_50}}</w:t>
             </w:r>
           </w:p>
         </w:tc>
@@ -12016,7 +12180,7 @@
                 <w:sz w:val="16"/>
                 <w:szCs w:val="16"/>
               </w:rPr>
-              <w:t>113,751</w:t>
+              <w:t>{{r3_inc_35_50}}</w:t>
             </w:r>
           </w:p>
         </w:tc>
@@ -12043,7 +12207,7 @@
                 <w:sz w:val="16"/>
                 <w:szCs w:val="16"/>
               </w:rPr>
-              <w:t>113,751</w:t>
+              <w:t>{{r5_inc_35_50}}</w:t>
             </w:r>
           </w:p>
         </w:tc>
@@ -12250,7 +12414,7 @@
                 <w:sz w:val="16"/>
                 <w:szCs w:val="16"/>
               </w:rPr>
-              <w:t>175,144</w:t>
+              <w:t>{{r1_inc_50_75}}</w:t>
             </w:r>
           </w:p>
         </w:tc>
@@ -12277,7 +12441,7 @@
                 <w:sz w:val="16"/>
                 <w:szCs w:val="16"/>
               </w:rPr>
-              <w:t>175,144</w:t>
+              <w:t>{{r3_inc_50_75}}</w:t>
             </w:r>
           </w:p>
         </w:tc>
@@ -12304,7 +12468,7 @@
                 <w:sz w:val="16"/>
                 <w:szCs w:val="16"/>
               </w:rPr>
-              <w:t>175,144</w:t>
+              <w:t>{{r5_inc_50_75}}</w:t>
             </w:r>
           </w:p>
         </w:tc>
@@ -12511,7 +12675,7 @@
                 <w:sz w:val="16"/>
                 <w:szCs w:val="16"/>
               </w:rPr>
-              <w:t>128,749</w:t>
+              <w:t>{{r1_inc_75_100}}</w:t>
             </w:r>
           </w:p>
         </w:tc>
@@ -12538,7 +12702,7 @@
                 <w:sz w:val="16"/>
                 <w:szCs w:val="16"/>
               </w:rPr>
-              <w:t>128,749</w:t>
+              <w:t>{{r3_inc_75_100}}</w:t>
             </w:r>
           </w:p>
         </w:tc>
@@ -12565,7 +12729,7 @@
                 <w:sz w:val="16"/>
                 <w:szCs w:val="16"/>
               </w:rPr>
-              <w:t>128,749</w:t>
+              <w:t>{{r5_inc_75_100}}</w:t>
             </w:r>
           </w:p>
         </w:tc>
@@ -12758,7 +12922,7 @@
                 <w:sz w:val="16"/>
                 <w:szCs w:val="16"/>
               </w:rPr>
-              <w:t>162,178</w:t>
+              <w:t>{{r1_inc_100_150}}</w:t>
             </w:r>
           </w:p>
         </w:tc>
@@ -12785,7 +12949,7 @@
                 <w:sz w:val="16"/>
                 <w:szCs w:val="16"/>
               </w:rPr>
-              <w:t>162,178</w:t>
+              <w:t>{{r3_inc_100_150}}</w:t>
             </w:r>
           </w:p>
         </w:tc>
@@ -12812,7 +12976,7 @@
                 <w:sz w:val="16"/>
                 <w:szCs w:val="16"/>
               </w:rPr>
-              <w:t>162,178</w:t>
+              <w:t>{{r5_inc_100_150}}</w:t>
             </w:r>
           </w:p>
         </w:tc>
@@ -12888,7 +13052,7 @@
                 <w:sz w:val="16"/>
                 <w:szCs w:val="16"/>
               </w:rPr>
-              <w:t>14,043</w:t>
+              <w:t>{{r1_built_2020_later}}</w:t>
             </w:r>
           </w:p>
         </w:tc>
@@ -12915,7 +13079,7 @@
                 <w:sz w:val="16"/>
                 <w:szCs w:val="16"/>
               </w:rPr>
-              <w:t>14,043</w:t>
+              <w:t>{{r3_built_2020_later}}</w:t>
             </w:r>
           </w:p>
         </w:tc>
@@ -12942,7 +13106,7 @@
                 <w:sz w:val="16"/>
                 <w:szCs w:val="16"/>
               </w:rPr>
-              <w:t>14,043</w:t>
+              <w:t>{{r5_built_2020_later}}</w:t>
             </w:r>
           </w:p>
         </w:tc>
@@ -13031,7 +13195,7 @@
                 <w:sz w:val="16"/>
                 <w:szCs w:val="16"/>
               </w:rPr>
-              <w:t>78,143</w:t>
+              <w:t>{{r1_inc_150_200}}</w:t>
             </w:r>
           </w:p>
         </w:tc>
@@ -13058,7 +13222,7 @@
                 <w:sz w:val="16"/>
                 <w:szCs w:val="16"/>
               </w:rPr>
-              <w:t>78,143</w:t>
+              <w:t>{{r3_inc_150_200}}</w:t>
             </w:r>
           </w:p>
         </w:tc>
@@ -13085,7 +13249,7 @@
                 <w:sz w:val="16"/>
                 <w:szCs w:val="16"/>
               </w:rPr>
-              <w:t>78,143</w:t>
+              <w:t>{{r5_inc_150_200}}</w:t>
             </w:r>
           </w:p>
         </w:tc>
@@ -13149,7 +13313,7 @@
                 <w:sz w:val="16"/>
                 <w:szCs w:val="16"/>
               </w:rPr>
-              <w:t>121,755</w:t>
+              <w:t>{{r1_built_2010_2019}}</w:t>
             </w:r>
           </w:p>
         </w:tc>
@@ -13176,7 +13340,7 @@
                 <w:sz w:val="16"/>
                 <w:szCs w:val="16"/>
               </w:rPr>
-              <w:t>129,654</w:t>
+              <w:t>{{r3_built_2010_2019}}</w:t>
             </w:r>
           </w:p>
         </w:tc>
@@ -13203,7 +13367,7 @@
                 <w:sz w:val="16"/>
                 <w:szCs w:val="16"/>
               </w:rPr>
-              <w:t>129,654</w:t>
+              <w:t>{{r5_built_2010_2019}}</w:t>
             </w:r>
           </w:p>
         </w:tc>
@@ -13292,7 +13456,7 @@
                 <w:sz w:val="16"/>
                 <w:szCs w:val="16"/>
               </w:rPr>
-              <w:t>111,683</w:t>
+              <w:t>{{r1_inc_200_plus}}</w:t>
             </w:r>
           </w:p>
         </w:tc>
@@ -13319,7 +13483,7 @@
                 <w:sz w:val="16"/>
                 <w:szCs w:val="16"/>
               </w:rPr>
-              <w:t>111,683</w:t>
+              <w:t>{{r3_inc_200_plus}}</w:t>
             </w:r>
           </w:p>
         </w:tc>
@@ -13346,7 +13510,7 @@
                 <w:sz w:val="16"/>
                 <w:szCs w:val="16"/>
               </w:rPr>
-              <w:t>111,683</w:t>
+              <w:t>{{r5_inc_200_plus}}</w:t>
             </w:r>
           </w:p>
         </w:tc>
@@ -13410,7 +13574,7 @@
                 <w:sz w:val="16"/>
                 <w:szCs w:val="16"/>
               </w:rPr>
-              <w:t>129,654</w:t>
+              <w:t>{{r1_built_2000_2009}}</w:t>
             </w:r>
           </w:p>
         </w:tc>
@@ -13437,7 +13601,7 @@
                 <w:sz w:val="16"/>
                 <w:szCs w:val="16"/>
               </w:rPr>
-              <w:t>129,654</w:t>
+              <w:t>{{r3_built_2000_2009}}</w:t>
             </w:r>
           </w:p>
         </w:tc>
@@ -13464,7 +13628,7 @@
                 <w:sz w:val="16"/>
                 <w:szCs w:val="16"/>
               </w:rPr>
-              <w:t>129,654</w:t>
+              <w:t>{{r5_built_2000_2009}}</w:t>
             </w:r>
           </w:p>
         </w:tc>
@@ -13656,7 +13820,7 @@
                 <w:sz w:val="16"/>
                 <w:szCs w:val="16"/>
               </w:rPr>
-              <w:t>120,269</w:t>
+              <w:t>{{r1_built_1990_1999}}</w:t>
             </w:r>
           </w:p>
         </w:tc>
@@ -13683,7 +13847,7 @@
                 <w:sz w:val="16"/>
                 <w:szCs w:val="16"/>
               </w:rPr>
-              <w:t>120,269</w:t>
+              <w:t>{{r3_built_1990_1999}}</w:t>
             </w:r>
           </w:p>
         </w:tc>
@@ -13710,7 +13874,7 @@
                 <w:sz w:val="16"/>
                 <w:szCs w:val="16"/>
               </w:rPr>
-              <w:t>120,269</w:t>
+              <w:t>{{r5_built_1990_1999}}</w:t>
             </w:r>
           </w:p>
         </w:tc>
@@ -13799,7 +13963,7 @@
                 <w:sz w:val="16"/>
                 <w:szCs w:val="16"/>
               </w:rPr>
-              <w:t>548,642</w:t>
+              <w:t>{{r1_units_1_det}}</w:t>
             </w:r>
           </w:p>
         </w:tc>
@@ -13826,7 +13990,7 @@
                 <w:sz w:val="16"/>
                 <w:szCs w:val="16"/>
               </w:rPr>
-              <w:t>548,642</w:t>
+              <w:t>{{r3_units_1_det}}</w:t>
             </w:r>
           </w:p>
         </w:tc>
@@ -13853,7 +14017,7 @@
                 <w:sz w:val="16"/>
                 <w:szCs w:val="16"/>
               </w:rPr>
-              <w:t>548,642</w:t>
+              <w:t>{{r5_units_1_det}}</w:t>
             </w:r>
           </w:p>
         </w:tc>
@@ -13917,7 +14081,7 @@
                 <w:sz w:val="16"/>
                 <w:szCs w:val="16"/>
               </w:rPr>
-              <w:t>184,099</w:t>
+              <w:t>{{r1_built_1980_1989}}</w:t>
             </w:r>
           </w:p>
         </w:tc>
@@ -13944,7 +14108,7 @@
                 <w:sz w:val="16"/>
                 <w:szCs w:val="16"/>
               </w:rPr>
-              <w:t>184,099</w:t>
+              <w:t>{{r3_built_1980_1989}}</w:t>
             </w:r>
           </w:p>
         </w:tc>
@@ -13971,7 +14135,7 @@
                 <w:sz w:val="16"/>
                 <w:szCs w:val="16"/>
               </w:rPr>
-              <w:t>184,099</w:t>
+              <w:t>{{r5_built_1980_1989}}</w:t>
             </w:r>
           </w:p>
         </w:tc>
@@ -14060,7 +14224,7 @@
                 <w:sz w:val="16"/>
                 <w:szCs w:val="16"/>
               </w:rPr>
-              <w:t>40,018</w:t>
+              <w:t>{{r1_units_1_att}}</w:t>
             </w:r>
           </w:p>
         </w:tc>
@@ -14087,7 +14251,7 @@
                 <w:sz w:val="16"/>
                 <w:szCs w:val="16"/>
               </w:rPr>
-              <w:t>40,018</w:t>
+              <w:t>{{r3_units_1_att}}</w:t>
             </w:r>
           </w:p>
         </w:tc>
@@ -14114,7 +14278,7 @@
                 <w:sz w:val="16"/>
                 <w:szCs w:val="16"/>
               </w:rPr>
-              <w:t>40,018</w:t>
+              <w:t>{{r5_units_1_att}}</w:t>
             </w:r>
           </w:p>
         </w:tc>
@@ -14178,7 +14342,7 @@
                 <w:sz w:val="16"/>
                 <w:szCs w:val="16"/>
               </w:rPr>
-              <w:t>169,987</w:t>
+              <w:t>{{r1_built_1970_1979}}</w:t>
             </w:r>
           </w:p>
         </w:tc>
@@ -14205,7 +14369,7 @@
                 <w:sz w:val="16"/>
                 <w:szCs w:val="16"/>
               </w:rPr>
-              <w:t>169,987</w:t>
+              <w:t>{{r3_built_1970_1979}}</w:t>
             </w:r>
           </w:p>
         </w:tc>
@@ -14232,7 +14396,7 @@
                 <w:sz w:val="16"/>
                 <w:szCs w:val="16"/>
               </w:rPr>
-              <w:t>169,987</w:t>
+              <w:t>{{r5_built_1970_1979}}</w:t>
             </w:r>
           </w:p>
         </w:tc>
@@ -14321,7 +14485,7 @@
                 <w:sz w:val="16"/>
                 <w:szCs w:val="16"/>
               </w:rPr>
-              <w:t>13,890</w:t>
+              <w:t>{{r1_units_2}}</w:t>
             </w:r>
           </w:p>
         </w:tc>
@@ -14348,7 +14512,7 @@
                 <w:sz w:val="16"/>
                 <w:szCs w:val="16"/>
               </w:rPr>
-              <w:t>13,890</w:t>
+              <w:t>{{r3_units_2}}</w:t>
             </w:r>
           </w:p>
         </w:tc>
@@ -14375,7 +14539,7 @@
                 <w:sz w:val="16"/>
                 <w:szCs w:val="16"/>
               </w:rPr>
-              <w:t>13,890</w:t>
+              <w:t>{{r5_units_2}}</w:t>
             </w:r>
           </w:p>
         </w:tc>
@@ -14439,7 +14603,7 @@
                 <w:sz w:val="16"/>
                 <w:szCs w:val="16"/>
               </w:rPr>
-              <w:t>129,214</w:t>
+              <w:t>{{r1_built_1960_1969}}</w:t>
             </w:r>
           </w:p>
         </w:tc>
@@ -14466,7 +14630,7 @@
                 <w:sz w:val="16"/>
                 <w:szCs w:val="16"/>
               </w:rPr>
-              <w:t>129,214</w:t>
+              <w:t>{{r3_built_1960_1969}}</w:t>
             </w:r>
           </w:p>
         </w:tc>
@@ -14493,7 +14657,7 @@
                 <w:sz w:val="16"/>
                 <w:szCs w:val="16"/>
               </w:rPr>
-              <w:t>129,214</w:t>
+              <w:t>{{r5_built_1960_1969}}</w:t>
             </w:r>
           </w:p>
         </w:tc>
@@ -14582,7 +14746,7 @@
                 <w:sz w:val="16"/>
                 <w:szCs w:val="16"/>
               </w:rPr>
-              <w:t>47,617</w:t>
+              <w:t>{{r1_units_3_4}}</w:t>
             </w:r>
           </w:p>
         </w:tc>
@@ -14609,7 +14773,7 @@
                 <w:sz w:val="16"/>
                 <w:szCs w:val="16"/>
               </w:rPr>
-              <w:t>47,617</w:t>
+              <w:t>{{r3_units_3_4}}</w:t>
             </w:r>
           </w:p>
         </w:tc>
@@ -14636,7 +14800,7 @@
                 <w:sz w:val="16"/>
                 <w:szCs w:val="16"/>
               </w:rPr>
-              <w:t>47,617</w:t>
+              <w:t>{{r5_units_3_4}}</w:t>
             </w:r>
           </w:p>
         </w:tc>
@@ -14700,7 +14864,7 @@
                 <w:sz w:val="16"/>
                 <w:szCs w:val="16"/>
               </w:rPr>
-              <w:t>113,626</w:t>
+              <w:t>{{r1_built_1950_1959}}</w:t>
             </w:r>
           </w:p>
         </w:tc>
@@ -14727,7 +14891,7 @@
                 <w:sz w:val="16"/>
                 <w:szCs w:val="16"/>
               </w:rPr>
-              <w:t>113,626</w:t>
+              <w:t>{{r3_built_1950_1959}}</w:t>
             </w:r>
           </w:p>
         </w:tc>
@@ -14754,7 +14918,7 @@
                 <w:sz w:val="16"/>
                 <w:szCs w:val="16"/>
               </w:rPr>
-              <w:t>113,626</w:t>
+              <w:t>{{r5_built_1950_1959}}</w:t>
             </w:r>
           </w:p>
         </w:tc>
@@ -14843,7 +15007,7 @@
                 <w:sz w:val="16"/>
                 <w:szCs w:val="16"/>
               </w:rPr>
-              <w:t>72,524</w:t>
+              <w:t>{{r1_units_5_9}}</w:t>
             </w:r>
           </w:p>
         </w:tc>
@@ -14870,7 +15034,7 @@
                 <w:sz w:val="16"/>
                 <w:szCs w:val="16"/>
               </w:rPr>
-              <w:t>72,524</w:t>
+              <w:t>{{r3_units_5_9}}</w:t>
             </w:r>
           </w:p>
         </w:tc>
@@ -14897,7 +15061,7 @@
                 <w:sz w:val="16"/>
                 <w:szCs w:val="16"/>
               </w:rPr>
-              <w:t>72,524</w:t>
+              <w:t>{{r5_units_5_9}}</w:t>
             </w:r>
           </w:p>
         </w:tc>
@@ -14961,7 +15125,7 @@
                 <w:sz w:val="16"/>
                 <w:szCs w:val="16"/>
               </w:rPr>
-              <w:t>34,161</w:t>
+              <w:t>{{r1_built_1940_1949}}</w:t>
             </w:r>
           </w:p>
         </w:tc>
@@ -14988,7 +15152,7 @@
                 <w:sz w:val="16"/>
                 <w:szCs w:val="16"/>
               </w:rPr>
-              <w:t>34,161</w:t>
+              <w:t>{{r3_built_1940_1949}}</w:t>
             </w:r>
           </w:p>
         </w:tc>
@@ -15015,7 +15179,7 @@
                 <w:sz w:val="16"/>
                 <w:szCs w:val="16"/>
               </w:rPr>
-              <w:t>34,161</w:t>
+              <w:t>{{r5_built_1940_1949}}</w:t>
             </w:r>
           </w:p>
         </w:tc>
@@ -15104,7 +15268,7 @@
                 <w:sz w:val="16"/>
                 <w:szCs w:val="16"/>
               </w:rPr>
-              <w:t>96,128</w:t>
+              <w:t>{{r1_units_10_19}}</w:t>
             </w:r>
           </w:p>
         </w:tc>
@@ -15131,7 +15295,7 @@
                 <w:sz w:val="16"/>
                 <w:szCs w:val="16"/>
               </w:rPr>
-              <w:t>96,128</w:t>
+              <w:t>{{r3_units_10_19}}</w:t>
             </w:r>
           </w:p>
         </w:tc>
@@ -15158,7 +15322,7 @@
                 <w:sz w:val="16"/>
                 <w:szCs w:val="16"/>
               </w:rPr>
-              <w:t>96,128</w:t>
+              <w:t>{{r5_units_10_19}}</w:t>
             </w:r>
           </w:p>
         </w:tc>
@@ -15234,7 +15398,7 @@
                 <w:sz w:val="16"/>
                 <w:szCs w:val="16"/>
               </w:rPr>
-              <w:t>36,663</w:t>
+              <w:t>{{r1_built_1939_earlier}}</w:t>
             </w:r>
           </w:p>
         </w:tc>
@@ -15261,7 +15425,7 @@
                 <w:sz w:val="16"/>
                 <w:szCs w:val="16"/>
               </w:rPr>
-              <w:t>36,663</w:t>
+              <w:t>{{r3_built_1939_earlier}}</w:t>
             </w:r>
           </w:p>
         </w:tc>
@@ -15288,7 +15452,7 @@
                 <w:sz w:val="16"/>
                 <w:szCs w:val="16"/>
               </w:rPr>
-              <w:t>36,663</w:t>
+              <w:t>{{r5_built_1939_earlier}}</w:t>
             </w:r>
           </w:p>
         </w:tc>
@@ -15377,7 +15541,7 @@
                 <w:sz w:val="16"/>
                 <w:szCs w:val="16"/>
               </w:rPr>
-              <w:t>68,327</w:t>
+              <w:t>{{r1_units_20_49}}</w:t>
             </w:r>
           </w:p>
         </w:tc>
@@ -15404,7 +15568,7 @@
                 <w:sz w:val="16"/>
                 <w:szCs w:val="16"/>
               </w:rPr>
-              <w:t>68,327</w:t>
+              <w:t>{{r3_units_20_49}}</w:t>
             </w:r>
           </w:p>
         </w:tc>
@@ -15431,7 +15595,7 @@
                 <w:sz w:val="16"/>
                 <w:szCs w:val="16"/>
               </w:rPr>
-              <w:t>68,327</w:t>
+              <w:t>{{r5_units_20_49}}</w:t>
             </w:r>
           </w:p>
         </w:tc>
@@ -15624,7 +15788,7 @@
                 <w:sz w:val="16"/>
                 <w:szCs w:val="16"/>
               </w:rPr>
-              <w:t>148,582</w:t>
+              <w:t>{{r1_units_50_plus}}</w:t>
             </w:r>
           </w:p>
         </w:tc>
@@ -15651,7 +15815,7 @@
                 <w:sz w:val="16"/>
                 <w:szCs w:val="16"/>
               </w:rPr>
-              <w:t>148,582</w:t>
+              <w:t>{{r3_units_50_plus}}</w:t>
             </w:r>
           </w:p>
         </w:tc>
@@ -15678,7 +15842,7 @@
                 <w:sz w:val="16"/>
                 <w:szCs w:val="16"/>
               </w:rPr>
-              <w:t>148,582</w:t>
+              <w:t>{{r5_units_50_plus}}</w:t>
             </w:r>
           </w:p>
         </w:tc>
@@ -15743,7 +15907,7 @@
                 <w:sz w:val="16"/>
                 <w:szCs w:val="16"/>
               </w:rPr>
-              <w:t>$577,622</w:t>
+              <w:t>{{r1_avg_home_value}}</w:t>
             </w:r>
           </w:p>
         </w:tc>
@@ -15771,7 +15935,7 @@
                 <w:sz w:val="16"/>
                 <w:szCs w:val="16"/>
               </w:rPr>
-              <w:t>$537,551</w:t>
+              <w:t>{{r3_avg_home_value}}</w:t>
             </w:r>
           </w:p>
         </w:tc>
@@ -15799,7 +15963,7 @@
                 <w:sz w:val="16"/>
                 <w:szCs w:val="16"/>
               </w:rPr>
-              <w:t>$508,186</w:t>
+              <w:t>{{r5_avg_home_value}}</w:t>
             </w:r>
           </w:p>
         </w:tc>
@@ -15888,7 +16052,7 @@
                 <w:sz w:val="16"/>
                 <w:szCs w:val="16"/>
               </w:rPr>
-              <w:t>17,521</w:t>
+              <w:t>{{r1_units_mobile}}</w:t>
             </w:r>
           </w:p>
         </w:tc>
@@ -15915,7 +16079,7 @@
                 <w:sz w:val="16"/>
                 <w:szCs w:val="16"/>
               </w:rPr>
-              <w:t>17,521</w:t>
+              <w:t>{{r3_units_mobile}}</w:t>
             </w:r>
           </w:p>
         </w:tc>
@@ -15942,7 +16106,7 @@
                 <w:sz w:val="16"/>
                 <w:szCs w:val="16"/>
               </w:rPr>
-              <w:t>17,521</w:t>
+              <w:t>{{r5_units_mobile}}</w:t>
             </w:r>
           </w:p>
         </w:tc>
@@ -16007,7 +16171,7 @@
                 <w:sz w:val="16"/>
                 <w:szCs w:val="16"/>
               </w:rPr>
-              <w:t>$551,178</w:t>
+              <w:t>{{r1_median_home_value}}</w:t>
             </w:r>
           </w:p>
         </w:tc>
@@ -16035,7 +16199,7 @@
                 <w:sz w:val="16"/>
                 <w:szCs w:val="16"/>
               </w:rPr>
-              <w:t>$486,662</w:t>
+              <w:t>{{r3_median_home_value}}</w:t>
             </w:r>
           </w:p>
         </w:tc>
@@ -16063,7 +16227,7 @@
                 <w:sz w:val="16"/>
                 <w:szCs w:val="16"/>
               </w:rPr>
-              <w:t>$459,236</w:t>
+              <w:t>{{r5_median_home_value}}</w:t>
             </w:r>
           </w:p>
         </w:tc>
@@ -16152,7 +16316,7 @@
                 <w:sz w:val="16"/>
                 <w:szCs w:val="16"/>
               </w:rPr>
-              <w:t>222</w:t>
+              <w:t>{{r1_units_other}}</w:t>
             </w:r>
           </w:p>
         </w:tc>
@@ -16179,7 +16343,7 @@
                 <w:sz w:val="16"/>
                 <w:szCs w:val="16"/>
               </w:rPr>
-              <w:t>222</w:t>
+              <w:t>{{r3_units_other}}</w:t>
             </w:r>
           </w:p>
         </w:tc>
@@ -16206,7 +16370,7 @@
                 <w:sz w:val="16"/>
                 <w:szCs w:val="16"/>
               </w:rPr>
-              <w:t>222</w:t>
+              <w:t>{{r5_units_other}}</w:t>
             </w:r>
           </w:p>
         </w:tc>
@@ -16218,19 +16382,23 @@
         <w:spacing w:line="276" w:lineRule="auto"/>
         <w:rPr>
           <w:rFonts w:asciiTheme="minorHAnsi" w:hAnsiTheme="minorHAnsi" w:cs="Arial"/>
+          <w:sz w:val="24"/>
+          <w:szCs w:val="24"/>
         </w:rPr>
       </w:pPr>
       <w:r>
         <w:rPr>
           <w:rFonts w:asciiTheme="minorHAnsi" w:hAnsiTheme="minorHAnsi" w:cs="Arial"/>
+          <w:sz w:val="24"/>
+          <w:szCs w:val="24"/>
         </w:rPr>
         <w:t xml:space="preserve">Source: </w:t>
       </w:r>
       <w:r>
         <w:rPr>
           <w:rFonts w:asciiTheme="minorHAnsi" w:hAnsiTheme="minorHAnsi" w:cs="Arial"/>
-          <w:sz w:val="18"/>
-          <w:szCs w:val="18"/>
+          <w:sz w:val="24"/>
+          <w:szCs w:val="24"/>
         </w:rPr>
         <w:t>Esri</w:t>
       </w:r>
@@ -16480,7 +16648,7 @@
                 <w:sz w:val="16"/>
                 <w:szCs w:val="16"/>
               </w:rPr>
-              <w:t>Texas</w:t>
+              <w:t>{{state}}</w:t>
             </w:r>
           </w:p>
         </w:tc>
@@ -16510,7 +16678,7 @@
                 <w:sz w:val="16"/>
                 <w:szCs w:val="16"/>
               </w:rPr>
-              <w:t>Dallas County, TX</w:t>
+              <w:t>{{county}}</w:t>
             </w:r>
           </w:p>
         </w:tc>
@@ -16573,7 +16741,7 @@
                 <w:sz w:val="16"/>
                 <w:szCs w:val="16"/>
               </w:rPr>
-              <w:t>Texas</w:t>
+              <w:t>{{state}}</w:t>
             </w:r>
           </w:p>
         </w:tc>
@@ -16604,7 +16772,7 @@
                 <w:sz w:val="16"/>
                 <w:szCs w:val="16"/>
               </w:rPr>
-              <w:t>Dallas County, TX</w:t>
+              <w:t>{{county}}</w:t>
             </w:r>
           </w:p>
         </w:tc>
@@ -19103,19 +19271,23 @@
         <w:spacing w:line="276" w:lineRule="auto"/>
         <w:rPr>
           <w:rFonts w:asciiTheme="minorHAnsi" w:hAnsiTheme="minorHAnsi" w:cs="Arial"/>
+          <w:sz w:val="24"/>
+          <w:szCs w:val="24"/>
         </w:rPr>
       </w:pPr>
       <w:r>
         <w:rPr>
           <w:rFonts w:asciiTheme="minorHAnsi" w:hAnsiTheme="minorHAnsi" w:cs="Arial"/>
+          <w:sz w:val="24"/>
+          <w:szCs w:val="24"/>
         </w:rPr>
         <w:t xml:space="preserve">Source: </w:t>
       </w:r>
       <w:r>
         <w:rPr>
           <w:rFonts w:asciiTheme="minorHAnsi" w:hAnsiTheme="minorHAnsi" w:cs="Arial"/>
-          <w:sz w:val="18"/>
-          <w:szCs w:val="18"/>
+          <w:sz w:val="24"/>
+          <w:szCs w:val="24"/>
         </w:rPr>
         <w:t>BLS (Bureau of Labor Statistics)</w:t>
       </w:r>
@@ -19158,6 +19330,7 @@
         <w:rPr>
           <w:rFonts w:asciiTheme="minorHAnsi" w:hAnsiTheme="minorHAnsi" w:cs="Arial"/>
         </w:rPr>
+        <w:t>{{economic_factors}}</w:t>
       </w:r>
       <w:r>
         <w:rPr>
@@ -19916,43 +20089,6 @@
         <w:rPr>
           <w:noProof/>
         </w:rPr>
-        <w:drawing>
-          <wp:inline distT="0" distB="0" distL="0" distR="0" wp14:anchorId="165AEDB4" wp14:editId="395DDB12">
-            <wp:extent cx="5902325" cy="7530465"/>
-            <wp:effectExtent l="0" t="0" r="3175" b="0"/>
-            <wp:docPr id="1892188906" name="Picture 1" descr="A screenshot of a website&#10;&#10;AI-generated content may be incorrect."/>
-            <wp:cNvGraphicFramePr>
-              <a:graphicFrameLocks xmlns:a="http://schemas.openxmlformats.org/drawingml/2006/main" noChangeAspect="1"/>
-            </wp:cNvGraphicFramePr>
-            <a:graphic xmlns:a="http://schemas.openxmlformats.org/drawingml/2006/main">
-              <a:graphicData uri="http://schemas.openxmlformats.org/drawingml/2006/picture">
-                <pic:pic xmlns:pic="http://schemas.openxmlformats.org/drawingml/2006/picture">
-                  <pic:nvPicPr>
-                    <pic:cNvPr id="1892188906" name="Picture 1" descr="A screenshot of a website&#10;&#10;AI-generated content may be incorrect."/>
-                    <pic:cNvPicPr>
-                      <a:picLocks noChangeAspect="1"/>
-                    </pic:cNvPicPr>
-                  </pic:nvPicPr>
-                  <pic:blipFill>
-                    <a:blip r:embed="rId15"/>
-                    <a:stretch>
-                      <a:fillRect/>
-                    </a:stretch>
-                  </pic:blipFill>
-                  <pic:spPr>
-                    <a:xfrm>
-                      <a:off x="0" y="0"/>
-                      <a:ext cx="5902325" cy="7530465"/>
-                    </a:xfrm>
-                    <a:prstGeom prst="rect">
-                      <a:avLst/>
-                    </a:prstGeom>
-                  </pic:spPr>
-                </pic:pic>
-              </a:graphicData>
-            </a:graphic>
-          </wp:inline>
-        </w:drawing>
       </w:r>
       <w:r>
         <w:rPr>
@@ -20243,7 +20379,7 @@
                 <w:sz w:val="20"/>
                 <w:szCs w:val="20"/>
               </w:rPr>
-              <w:t>{{reconciliation_summary}}</w:t>
+              <w:t>{{reconciliation_notes}}</w:t>
             </w:r>
           </w:p>
         </w:tc>
@@ -20602,15 +20738,6 @@
         </w:tc>
       </w:tr>
     </w:tbl>
-    <w:p>
-      <w:pPr>
-        <w:pStyle w:val="Heading2"/>
-        <w:spacing w:line="276" w:lineRule="auto"/>
-      </w:pPr>
-      <w:r>
-        <w:t>{{sales_conclusion}}</w:t>
-      </w:r>
-    </w:p>
     <w:p>
       <w:pPr>
         <w:pStyle w:val="Heading2"/>

</xml_diff>